<commit_message>
Regenerate Android rebuild spec DOCX with latest SaaS blocking details.
Co-authored-by: Cursor <cursoragent@cursor.com>
</commit_message>
<xml_diff>
--- a/docs/ConsTrakr-Android-Rebuild-Spec.docx
+++ b/docs/ConsTrakr-Android-Rebuild-Spec.docx
@@ -4091,6 +4091,14 @@
     </w:p>
     <w:p>
       <w:pPr>
+        <w:pStyle w:val="Heading1"/>
+      </w:pPr>
+      <w:r>
+        <w:t>7. Web-Only vs App Scope</w:t>
+      </w:r>
+    </w:p>
+    <w:p>
+      <w:pPr>
         <w:pStyle w:val="Heading2"/>
       </w:pPr>
       <w:r>

</xml_diff>